<commit_message>
Remove outdated practical documents and question banks from the repository
</commit_message>
<xml_diff>
--- a/23CS091_Practical 6.docx
+++ b/23CS091_Practical 6.docx
@@ -464,8 +464,16 @@
               <w:rPr>
                 <w:rFonts w:ascii="Times New Roman" w:eastAsia="Times New Roman" w:hAnsi="Times New Roman" w:cs="Times New Roman"/>
               </w:rPr>
-              <w:t>Git workflow successfully completed..</w:t>
-            </w:r>
+              <w:t xml:space="preserve">Git workflow successfully </w:t>
+            </w:r>
+            <w:proofErr w:type="gramStart"/>
+            <w:r>
+              <w:rPr>
+                <w:rFonts w:ascii="Times New Roman" w:eastAsia="Times New Roman" w:hAnsi="Times New Roman" w:cs="Times New Roman"/>
+              </w:rPr>
+              <w:t>completed..</w:t>
+            </w:r>
+            <w:proofErr w:type="gramEnd"/>
           </w:p>
         </w:tc>
       </w:tr>
@@ -561,7 +569,25 @@
                 <w:b/>
                 <w:bCs/>
               </w:rPr>
-              <w:t xml:space="preserve">Verify Installation : </w:t>
+              <w:t xml:space="preserve">Verify </w:t>
+            </w:r>
+            <w:proofErr w:type="gramStart"/>
+            <w:r>
+              <w:rPr>
+                <w:rFonts w:ascii="Arial" w:eastAsia="Arial" w:hAnsi="Arial" w:cs="Arial"/>
+                <w:b/>
+                <w:bCs/>
+              </w:rPr>
+              <w:t>Installation :</w:t>
+            </w:r>
+            <w:proofErr w:type="gramEnd"/>
+            <w:r>
+              <w:rPr>
+                <w:rFonts w:ascii="Arial" w:eastAsia="Arial" w:hAnsi="Arial" w:cs="Arial"/>
+                <w:b/>
+                <w:bCs/>
+              </w:rPr>
+              <w:t xml:space="preserve"> </w:t>
             </w:r>
           </w:p>
           <w:p>
@@ -600,7 +626,25 @@
                 <w:b/>
                 <w:bCs/>
               </w:rPr>
-              <w:t xml:space="preserve">Set username and password : </w:t>
+              <w:t xml:space="preserve">Set username and </w:t>
+            </w:r>
+            <w:proofErr w:type="gramStart"/>
+            <w:r>
+              <w:rPr>
+                <w:rFonts w:ascii="Arial" w:eastAsia="Arial" w:hAnsi="Arial" w:cs="Arial"/>
+                <w:b/>
+                <w:bCs/>
+              </w:rPr>
+              <w:t>password :</w:t>
+            </w:r>
+            <w:proofErr w:type="gramEnd"/>
+            <w:r>
+              <w:rPr>
+                <w:rFonts w:ascii="Arial" w:eastAsia="Arial" w:hAnsi="Arial" w:cs="Arial"/>
+                <w:b/>
+                <w:bCs/>
+              </w:rPr>
+              <w:t xml:space="preserve"> </w:t>
             </w:r>
           </w:p>
           <w:p>
@@ -631,7 +675,25 @@
                 <w:rFonts w:ascii="Courier New" w:eastAsia="Courier New" w:hAnsi="Courier New" w:cs="Courier New"/>
                 <w:highlight w:val="yellow"/>
               </w:rPr>
-              <w:t>git config --global user.email "email ID"</w:t>
+              <w:t xml:space="preserve">git config --global </w:t>
+            </w:r>
+            <w:proofErr w:type="spellStart"/>
+            <w:proofErr w:type="gramStart"/>
+            <w:r>
+              <w:rPr>
+                <w:rFonts w:ascii="Courier New" w:eastAsia="Courier New" w:hAnsi="Courier New" w:cs="Courier New"/>
+                <w:highlight w:val="yellow"/>
+              </w:rPr>
+              <w:t>user.email</w:t>
+            </w:r>
+            <w:proofErr w:type="spellEnd"/>
+            <w:proofErr w:type="gramEnd"/>
+            <w:r>
+              <w:rPr>
+                <w:rFonts w:ascii="Courier New" w:eastAsia="Courier New" w:hAnsi="Courier New" w:cs="Courier New"/>
+                <w:highlight w:val="yellow"/>
+              </w:rPr>
+              <w:t xml:space="preserve"> "email ID"</w:t>
             </w:r>
           </w:p>
           <w:p>
@@ -680,17 +742,66 @@
               <w:spacing w:after="0" w:line="276" w:lineRule="auto"/>
               <w:rPr>
                 <w:rFonts w:ascii="Arial" w:eastAsia="Arial" w:hAnsi="Arial" w:cs="Arial"/>
-              </w:rPr>
-            </w:pPr>
-            <w:r>
-              <w:rPr>
-                <w:rFonts w:ascii="Arial" w:eastAsia="Arial" w:hAnsi="Arial" w:cs="Arial"/>
                 <w:noProof/>
+              </w:rPr>
+            </w:pPr>
+          </w:p>
+          <w:p>
+            <w:pPr>
+              <w:spacing w:after="0" w:line="276" w:lineRule="auto"/>
+              <w:rPr>
+                <w:rFonts w:ascii="Arial" w:eastAsia="Arial" w:hAnsi="Arial" w:cs="Arial"/>
+              </w:rPr>
+            </w:pPr>
+            <w:r>
+              <w:rPr>
+                <w:rFonts w:ascii="Arial" w:eastAsia="Arial" w:hAnsi="Arial" w:cs="Arial"/>
               </w:rPr>
               <w:lastRenderedPageBreak/>
               <w:drawing>
-                <wp:inline distT="0" distB="0" distL="0" distR="0" wp14:anchorId="50D6C4A6" wp14:editId="5A430213">
-                  <wp:extent cx="5730240" cy="3437890"/>
+                <wp:inline distT="0" distB="0" distL="0" distR="0" wp14:anchorId="1D403D70" wp14:editId="4481A251">
+                  <wp:extent cx="5730240" cy="1245235"/>
+                  <wp:effectExtent l="0" t="0" r="3810" b="0"/>
+                  <wp:docPr id="330991075" name="Picture 1"/>
+                  <wp:cNvGraphicFramePr>
+                    <a:graphicFrameLocks xmlns:a="http://schemas.openxmlformats.org/drawingml/2006/main" noChangeAspect="1"/>
+                  </wp:cNvGraphicFramePr>
+                  <a:graphic xmlns:a="http://schemas.openxmlformats.org/drawingml/2006/main">
+                    <a:graphicData uri="http://schemas.openxmlformats.org/drawingml/2006/picture">
+                      <pic:pic xmlns:pic="http://schemas.openxmlformats.org/drawingml/2006/picture">
+                        <pic:nvPicPr>
+                          <pic:cNvPr id="330991075" name=""/>
+                          <pic:cNvPicPr/>
+                        </pic:nvPicPr>
+                        <pic:blipFill>
+                          <a:blip r:embed="rId9"/>
+                          <a:stretch>
+                            <a:fillRect/>
+                          </a:stretch>
+                        </pic:blipFill>
+                        <pic:spPr>
+                          <a:xfrm>
+                            <a:off x="0" y="0"/>
+                            <a:ext cx="5730240" cy="1245235"/>
+                          </a:xfrm>
+                          <a:prstGeom prst="rect">
+                            <a:avLst/>
+                          </a:prstGeom>
+                        </pic:spPr>
+                      </pic:pic>
+                    </a:graphicData>
+                  </a:graphic>
+                </wp:inline>
+              </w:drawing>
+            </w:r>
+            <w:r>
+              <w:rPr>
+                <w:rFonts w:ascii="Arial" w:eastAsia="Arial" w:hAnsi="Arial" w:cs="Arial"/>
+                <w:noProof/>
+              </w:rPr>
+              <w:drawing>
+                <wp:inline distT="0" distB="0" distL="0" distR="0" wp14:anchorId="50D6C4A6" wp14:editId="7CF307B2">
+                  <wp:extent cx="5730240" cy="2271077"/>
                   <wp:effectExtent l="0" t="0" r="3810" b="0"/>
                   <wp:docPr id="1067023980" name="Picture 1"/>
                   <wp:cNvGraphicFramePr>
@@ -703,20 +814,29 @@
                           <pic:cNvPr id="1067023980" name=""/>
                           <pic:cNvPicPr/>
                         </pic:nvPicPr>
-                        <pic:blipFill>
-                          <a:blip r:embed="rId9"/>
+                        <pic:blipFill rotWithShape="1">
+                          <a:blip r:embed="rId10"/>
+                          <a:srcRect t="33940"/>
                           <a:stretch>
                             <a:fillRect/>
                           </a:stretch>
                         </pic:blipFill>
-                        <pic:spPr>
+                        <pic:spPr bwMode="auto">
                           <a:xfrm>
                             <a:off x="0" y="0"/>
-                            <a:ext cx="5730240" cy="3437890"/>
+                            <a:ext cx="5730240" cy="2271077"/>
                           </a:xfrm>
                           <a:prstGeom prst="rect">
                             <a:avLst/>
                           </a:prstGeom>
+                          <a:ln>
+                            <a:noFill/>
+                          </a:ln>
+                          <a:extLst>
+                            <a:ext uri="{53640926-AAD7-44D8-BBD7-CCE9431645EC}">
+                              <a14:shadowObscured xmlns:a14="http://schemas.microsoft.com/office/drawing/2010/main"/>
+                            </a:ext>
+                          </a:extLst>
                         </pic:spPr>
                       </pic:pic>
                     </a:graphicData>
@@ -744,22 +864,60 @@
               <w:rPr>
                 <w:rFonts w:ascii="Arial" w:eastAsia="Arial" w:hAnsi="Arial" w:cs="Arial"/>
               </w:rPr>
-              <w:t>Go to github , and create new repository ,</w:t>
-            </w:r>
-          </w:p>
-          <w:p>
-            <w:pPr>
-              <w:spacing w:after="0" w:line="276" w:lineRule="auto"/>
-              <w:rPr>
-                <w:rFonts w:ascii="Arial" w:eastAsia="Arial" w:hAnsi="Arial" w:cs="Arial"/>
-              </w:rPr>
-            </w:pPr>
-            <w:r>
-              <w:rPr>
-                <w:rFonts w:ascii="Arial" w:eastAsia="Arial" w:hAnsi="Arial" w:cs="Arial"/>
-              </w:rPr>
-              <w:t>Click new for create new repository .</w:t>
-            </w:r>
+              <w:t xml:space="preserve">Go to </w:t>
+            </w:r>
+            <w:proofErr w:type="spellStart"/>
+            <w:proofErr w:type="gramStart"/>
+            <w:r>
+              <w:rPr>
+                <w:rFonts w:ascii="Arial" w:eastAsia="Arial" w:hAnsi="Arial" w:cs="Arial"/>
+              </w:rPr>
+              <w:t>github</w:t>
+            </w:r>
+            <w:proofErr w:type="spellEnd"/>
+            <w:r>
+              <w:rPr>
+                <w:rFonts w:ascii="Arial" w:eastAsia="Arial" w:hAnsi="Arial" w:cs="Arial"/>
+              </w:rPr>
+              <w:t xml:space="preserve"> ,</w:t>
+            </w:r>
+            <w:proofErr w:type="gramEnd"/>
+            <w:r>
+              <w:rPr>
+                <w:rFonts w:ascii="Arial" w:eastAsia="Arial" w:hAnsi="Arial" w:cs="Arial"/>
+              </w:rPr>
+              <w:t xml:space="preserve"> and create new </w:t>
+            </w:r>
+            <w:proofErr w:type="gramStart"/>
+            <w:r>
+              <w:rPr>
+                <w:rFonts w:ascii="Arial" w:eastAsia="Arial" w:hAnsi="Arial" w:cs="Arial"/>
+              </w:rPr>
+              <w:t>repository ,</w:t>
+            </w:r>
+            <w:proofErr w:type="gramEnd"/>
+          </w:p>
+          <w:p>
+            <w:pPr>
+              <w:spacing w:after="0" w:line="276" w:lineRule="auto"/>
+              <w:rPr>
+                <w:rFonts w:ascii="Arial" w:eastAsia="Arial" w:hAnsi="Arial" w:cs="Arial"/>
+              </w:rPr>
+            </w:pPr>
+            <w:r>
+              <w:rPr>
+                <w:rFonts w:ascii="Arial" w:eastAsia="Arial" w:hAnsi="Arial" w:cs="Arial"/>
+              </w:rPr>
+              <w:t xml:space="preserve">Click new for create new </w:t>
+            </w:r>
+            <w:proofErr w:type="gramStart"/>
+            <w:r>
+              <w:rPr>
+                <w:rFonts w:ascii="Arial" w:eastAsia="Arial" w:hAnsi="Arial" w:cs="Arial"/>
+              </w:rPr>
+              <w:t>repository .</w:t>
+            </w:r>
+            <w:proofErr w:type="gramEnd"/>
           </w:p>
           <w:p>
             <w:pPr>
@@ -781,11 +939,12 @@
                 <w:rFonts w:ascii="Arial" w:eastAsia="Arial" w:hAnsi="Arial" w:cs="Arial"/>
                 <w:noProof/>
               </w:rPr>
+              <w:lastRenderedPageBreak/>
               <w:drawing>
-                <wp:inline distT="0" distB="0" distL="0" distR="0" wp14:anchorId="2C7D4C80" wp14:editId="5DEC895D">
-                  <wp:extent cx="5730240" cy="2778760"/>
-                  <wp:effectExtent l="0" t="0" r="3810" b="2540"/>
-                  <wp:docPr id="1100557589" name="Picture 1"/>
+                <wp:inline distT="0" distB="0" distL="0" distR="0" wp14:anchorId="7A0DA572" wp14:editId="69515173">
+                  <wp:extent cx="4381500" cy="4363050"/>
+                  <wp:effectExtent l="0" t="0" r="0" b="0"/>
+                  <wp:docPr id="377650206" name="Picture 1"/>
                   <wp:cNvGraphicFramePr>
                     <a:graphicFrameLocks xmlns:a="http://schemas.openxmlformats.org/drawingml/2006/main" noChangeAspect="1"/>
                   </wp:cNvGraphicFramePr>
@@ -793,71 +952,7 @@
                     <a:graphicData uri="http://schemas.openxmlformats.org/drawingml/2006/picture">
                       <pic:pic xmlns:pic="http://schemas.openxmlformats.org/drawingml/2006/picture">
                         <pic:nvPicPr>
-                          <pic:cNvPr id="1100557589" name=""/>
-                          <pic:cNvPicPr/>
-                        </pic:nvPicPr>
-                        <pic:blipFill>
-                          <a:blip r:embed="rId10"/>
-                          <a:stretch>
-                            <a:fillRect/>
-                          </a:stretch>
-                        </pic:blipFill>
-                        <pic:spPr>
-                          <a:xfrm>
-                            <a:off x="0" y="0"/>
-                            <a:ext cx="5730240" cy="2778760"/>
-                          </a:xfrm>
-                          <a:prstGeom prst="rect">
-                            <a:avLst/>
-                          </a:prstGeom>
-                        </pic:spPr>
-                      </pic:pic>
-                    </a:graphicData>
-                  </a:graphic>
-                </wp:inline>
-              </w:drawing>
-            </w:r>
-          </w:p>
-          <w:p>
-            <w:pPr>
-              <w:spacing w:after="0" w:line="276" w:lineRule="auto"/>
-              <w:rPr>
-                <w:rFonts w:ascii="Arial" w:eastAsia="Arial" w:hAnsi="Arial" w:cs="Arial"/>
-              </w:rPr>
-            </w:pPr>
-            <w:r>
-              <w:rPr>
-                <w:rFonts w:ascii="Arial" w:eastAsia="Arial" w:hAnsi="Arial" w:cs="Arial"/>
-              </w:rPr>
-              <w:t>Enter name of repository and choose visibility (public/private) and Click button “Create repository”</w:t>
-            </w:r>
-          </w:p>
-          <w:p>
-            <w:pPr>
-              <w:spacing w:after="0" w:line="276" w:lineRule="auto"/>
-              <w:rPr>
-                <w:rFonts w:ascii="Arial" w:eastAsia="Arial" w:hAnsi="Arial" w:cs="Arial"/>
-              </w:rPr>
-            </w:pPr>
-            <w:r>
-              <w:rPr>
-                <w:rFonts w:ascii="Arial" w:eastAsia="Arial" w:hAnsi="Arial" w:cs="Arial"/>
-                <w:noProof/>
-              </w:rPr>
-              <w:lastRenderedPageBreak/>
-              <w:drawing>
-                <wp:inline distT="0" distB="0" distL="0" distR="0" wp14:anchorId="1FB6F5D9" wp14:editId="49023809">
-                  <wp:extent cx="5730240" cy="4311650"/>
-                  <wp:effectExtent l="0" t="0" r="3810" b="0"/>
-                  <wp:docPr id="1254119784" name="Picture 1"/>
-                  <wp:cNvGraphicFramePr>
-                    <a:graphicFrameLocks xmlns:a="http://schemas.openxmlformats.org/drawingml/2006/main" noChangeAspect="1"/>
-                  </wp:cNvGraphicFramePr>
-                  <a:graphic xmlns:a="http://schemas.openxmlformats.org/drawingml/2006/main">
-                    <a:graphicData uri="http://schemas.openxmlformats.org/drawingml/2006/picture">
-                      <pic:pic xmlns:pic="http://schemas.openxmlformats.org/drawingml/2006/picture">
-                        <pic:nvPicPr>
-                          <pic:cNvPr id="1254119784" name=""/>
+                          <pic:cNvPr id="377650206" name=""/>
                           <pic:cNvPicPr/>
                         </pic:nvPicPr>
                         <pic:blipFill>
@@ -869,7 +964,7 @@
                         <pic:spPr>
                           <a:xfrm>
                             <a:off x="0" y="0"/>
-                            <a:ext cx="5730240" cy="4311650"/>
+                            <a:ext cx="4394286" cy="4375782"/>
                           </a:xfrm>
                           <a:prstGeom prst="rect">
                             <a:avLst/>
@@ -892,13 +987,34 @@
             <w:r>
               <w:rPr>
                 <w:rFonts w:ascii="Arial" w:eastAsia="Arial" w:hAnsi="Arial" w:cs="Arial"/>
-                <w:noProof/>
+              </w:rPr>
+              <w:t>Enter name of repository and choose visibility (public/private) and Click button “Create repository”</w:t>
+            </w:r>
+          </w:p>
+          <w:p>
+            <w:pPr>
+              <w:spacing w:after="0" w:line="276" w:lineRule="auto"/>
+              <w:rPr>
+                <w:rFonts w:ascii="Arial" w:eastAsia="Arial" w:hAnsi="Arial" w:cs="Arial"/>
+              </w:rPr>
+            </w:pPr>
+          </w:p>
+          <w:p>
+            <w:pPr>
+              <w:spacing w:after="0" w:line="276" w:lineRule="auto"/>
+              <w:rPr>
+                <w:rFonts w:ascii="Arial" w:eastAsia="Arial" w:hAnsi="Arial" w:cs="Arial"/>
+              </w:rPr>
+            </w:pPr>
+            <w:r>
+              <w:rPr>
+                <w:rFonts w:ascii="Arial" w:eastAsia="Arial" w:hAnsi="Arial" w:cs="Arial"/>
               </w:rPr>
               <w:drawing>
-                <wp:inline distT="0" distB="0" distL="0" distR="0" wp14:anchorId="3BB06260" wp14:editId="78BAD789">
-                  <wp:extent cx="5730240" cy="3324860"/>
-                  <wp:effectExtent l="0" t="0" r="3810" b="8890"/>
-                  <wp:docPr id="424467436" name="Picture 1"/>
+                <wp:inline distT="0" distB="0" distL="0" distR="0" wp14:anchorId="716D5736" wp14:editId="0AB7A5C9">
+                  <wp:extent cx="5730240" cy="3030220"/>
+                  <wp:effectExtent l="0" t="0" r="3810" b="0"/>
+                  <wp:docPr id="195750652" name="Picture 1"/>
                   <wp:cNvGraphicFramePr>
                     <a:graphicFrameLocks xmlns:a="http://schemas.openxmlformats.org/drawingml/2006/main" noChangeAspect="1"/>
                   </wp:cNvGraphicFramePr>
@@ -906,7 +1022,7 @@
                     <a:graphicData uri="http://schemas.openxmlformats.org/drawingml/2006/picture">
                       <pic:pic xmlns:pic="http://schemas.openxmlformats.org/drawingml/2006/picture">
                         <pic:nvPicPr>
-                          <pic:cNvPr id="424467436" name=""/>
+                          <pic:cNvPr id="195750652" name=""/>
                           <pic:cNvPicPr/>
                         </pic:nvPicPr>
                         <pic:blipFill>
@@ -918,7 +1034,7 @@
                         <pic:spPr>
                           <a:xfrm>
                             <a:off x="0" y="0"/>
-                            <a:ext cx="5730240" cy="3324860"/>
+                            <a:ext cx="5730240" cy="3030220"/>
                           </a:xfrm>
                           <a:prstGeom prst="rect">
                             <a:avLst/>
@@ -956,42 +1072,68 @@
               <w:rPr>
                 <w:rFonts w:ascii="Arial" w:eastAsia="Arial" w:hAnsi="Arial" w:cs="Arial"/>
               </w:rPr>
+              <w:lastRenderedPageBreak/>
               <w:br/>
-              <w:t>Now Go to the Project folder .</w:t>
-            </w:r>
-          </w:p>
-          <w:p>
-            <w:pPr>
-              <w:spacing w:after="0" w:line="276" w:lineRule="auto"/>
-              <w:rPr>
-                <w:rFonts w:ascii="Courier New" w:eastAsia="Courier New" w:hAnsi="Courier New" w:cs="Courier New"/>
-                <w:highlight w:val="yellow"/>
-              </w:rPr>
-            </w:pPr>
-            <w:r>
-              <w:rPr>
-                <w:rFonts w:ascii="Courier New" w:eastAsia="Courier New" w:hAnsi="Courier New" w:cs="Courier New"/>
-                <w:highlight w:val="yellow"/>
-              </w:rPr>
-              <w:t>git init</w:t>
-            </w:r>
-          </w:p>
-          <w:p>
-            <w:pPr>
-              <w:spacing w:after="0" w:line="276" w:lineRule="auto"/>
-              <w:rPr>
-                <w:rFonts w:ascii="Courier New" w:eastAsia="Courier New" w:hAnsi="Courier New" w:cs="Courier New"/>
-                <w:highlight w:val="yellow"/>
-              </w:rPr>
-            </w:pPr>
-            <w:r>
-              <w:rPr>
-                <w:rFonts w:ascii="Courier New" w:eastAsia="Courier New" w:hAnsi="Courier New" w:cs="Courier New"/>
-                <w:highlight w:val="yellow"/>
-              </w:rPr>
-              <w:lastRenderedPageBreak/>
-              <w:t>git add .</w:t>
-            </w:r>
+              <w:t xml:space="preserve">Now Go to the Project </w:t>
+            </w:r>
+            <w:proofErr w:type="gramStart"/>
+            <w:r>
+              <w:rPr>
+                <w:rFonts w:ascii="Arial" w:eastAsia="Arial" w:hAnsi="Arial" w:cs="Arial"/>
+              </w:rPr>
+              <w:t>folder .</w:t>
+            </w:r>
+            <w:proofErr w:type="gramEnd"/>
+          </w:p>
+          <w:p>
+            <w:pPr>
+              <w:spacing w:after="0" w:line="276" w:lineRule="auto"/>
+              <w:rPr>
+                <w:rFonts w:ascii="Courier New" w:eastAsia="Courier New" w:hAnsi="Courier New" w:cs="Courier New"/>
+                <w:highlight w:val="yellow"/>
+              </w:rPr>
+            </w:pPr>
+            <w:r>
+              <w:rPr>
+                <w:rFonts w:ascii="Courier New" w:eastAsia="Courier New" w:hAnsi="Courier New" w:cs="Courier New"/>
+                <w:highlight w:val="yellow"/>
+              </w:rPr>
+              <w:t xml:space="preserve">git </w:t>
+            </w:r>
+            <w:proofErr w:type="spellStart"/>
+            <w:r>
+              <w:rPr>
+                <w:rFonts w:ascii="Courier New" w:eastAsia="Courier New" w:hAnsi="Courier New" w:cs="Courier New"/>
+                <w:highlight w:val="yellow"/>
+              </w:rPr>
+              <w:t>init</w:t>
+            </w:r>
+            <w:proofErr w:type="spellEnd"/>
+          </w:p>
+          <w:p>
+            <w:pPr>
+              <w:spacing w:after="0" w:line="276" w:lineRule="auto"/>
+              <w:rPr>
+                <w:rFonts w:ascii="Courier New" w:eastAsia="Courier New" w:hAnsi="Courier New" w:cs="Courier New"/>
+                <w:highlight w:val="yellow"/>
+              </w:rPr>
+            </w:pPr>
+            <w:r>
+              <w:rPr>
+                <w:rFonts w:ascii="Courier New" w:eastAsia="Courier New" w:hAnsi="Courier New" w:cs="Courier New"/>
+                <w:highlight w:val="yellow"/>
+              </w:rPr>
+              <w:t xml:space="preserve">git </w:t>
+            </w:r>
+            <w:proofErr w:type="gramStart"/>
+            <w:r>
+              <w:rPr>
+                <w:rFonts w:ascii="Courier New" w:eastAsia="Courier New" w:hAnsi="Courier New" w:cs="Courier New"/>
+                <w:highlight w:val="yellow"/>
+              </w:rPr>
+              <w:t>add .</w:t>
+            </w:r>
+            <w:proofErr w:type="gramEnd"/>
           </w:p>
           <w:p>
             <w:pPr>
@@ -1075,13 +1217,12 @@
             <w:r>
               <w:rPr>
                 <w:rFonts w:ascii="Arial" w:eastAsia="Arial" w:hAnsi="Arial" w:cs="Arial"/>
-                <w:noProof/>
               </w:rPr>
               <w:drawing>
-                <wp:inline distT="0" distB="0" distL="0" distR="0" wp14:anchorId="2EBA206C" wp14:editId="357A8A47">
-                  <wp:extent cx="5730240" cy="3009900"/>
-                  <wp:effectExtent l="0" t="0" r="3810" b="0"/>
-                  <wp:docPr id="754200161" name="Picture 1"/>
+                <wp:inline distT="0" distB="0" distL="0" distR="0" wp14:anchorId="270AC610" wp14:editId="635D2C00">
+                  <wp:extent cx="5730240" cy="2912745"/>
+                  <wp:effectExtent l="0" t="0" r="3810" b="1905"/>
+                  <wp:docPr id="620580505" name="Picture 1"/>
                   <wp:cNvGraphicFramePr>
                     <a:graphicFrameLocks xmlns:a="http://schemas.openxmlformats.org/drawingml/2006/main" noChangeAspect="1"/>
                   </wp:cNvGraphicFramePr>
@@ -1089,7 +1230,7 @@
                     <a:graphicData uri="http://schemas.openxmlformats.org/drawingml/2006/picture">
                       <pic:pic xmlns:pic="http://schemas.openxmlformats.org/drawingml/2006/picture">
                         <pic:nvPicPr>
-                          <pic:cNvPr id="754200161" name=""/>
+                          <pic:cNvPr id="620580505" name=""/>
                           <pic:cNvPicPr/>
                         </pic:nvPicPr>
                         <pic:blipFill>
@@ -1101,7 +1242,7 @@
                         <pic:spPr>
                           <a:xfrm>
                             <a:off x="0" y="0"/>
-                            <a:ext cx="5730240" cy="3009900"/>
+                            <a:ext cx="5730240" cy="2912745"/>
                           </a:xfrm>
                           <a:prstGeom prst="rect">
                             <a:avLst/>
@@ -1203,7 +1344,21 @@
               <w:rPr>
                 <w:rFonts w:ascii="Arial" w:eastAsia="Arial" w:hAnsi="Arial" w:cs="Arial"/>
               </w:rPr>
-              <w:t xml:space="preserve">Now pull from github, First check remote as local machine </w:t>
+              <w:t xml:space="preserve">Now pull from </w:t>
+            </w:r>
+            <w:proofErr w:type="spellStart"/>
+            <w:r>
+              <w:rPr>
+                <w:rFonts w:ascii="Arial" w:eastAsia="Arial" w:hAnsi="Arial" w:cs="Arial"/>
+              </w:rPr>
+              <w:t>github</w:t>
+            </w:r>
+            <w:proofErr w:type="spellEnd"/>
+            <w:r>
+              <w:rPr>
+                <w:rFonts w:ascii="Arial" w:eastAsia="Arial" w:hAnsi="Arial" w:cs="Arial"/>
+              </w:rPr>
+              <w:t xml:space="preserve">, First check remote as local machine </w:t>
             </w:r>
             <w:r>
               <w:rPr>
@@ -1307,24 +1462,47 @@
               <w:rPr>
                 <w:rFonts w:ascii="Arial" w:eastAsia="Arial" w:hAnsi="Arial" w:cs="Arial"/>
               </w:rPr>
-              <w:t>Now commit changes to Github.</w:t>
-            </w:r>
-          </w:p>
-          <w:p>
-            <w:pPr>
-              <w:spacing w:after="0" w:line="276" w:lineRule="auto"/>
-              <w:rPr>
-                <w:rFonts w:ascii="Courier New" w:eastAsia="Courier New" w:hAnsi="Courier New" w:cs="Courier New"/>
-                <w:highlight w:val="yellow"/>
-              </w:rPr>
-            </w:pPr>
-            <w:r>
-              <w:rPr>
-                <w:rFonts w:ascii="Courier New" w:eastAsia="Courier New" w:hAnsi="Courier New" w:cs="Courier New"/>
-                <w:highlight w:val="yellow"/>
-              </w:rPr>
-              <w:t>git add .</w:t>
-            </w:r>
+              <w:t xml:space="preserve">Now commit changes to </w:t>
+            </w:r>
+            <w:proofErr w:type="spellStart"/>
+            <w:r>
+              <w:rPr>
+                <w:rFonts w:ascii="Arial" w:eastAsia="Arial" w:hAnsi="Arial" w:cs="Arial"/>
+              </w:rPr>
+              <w:t>Github</w:t>
+            </w:r>
+            <w:proofErr w:type="spellEnd"/>
+            <w:r>
+              <w:rPr>
+                <w:rFonts w:ascii="Arial" w:eastAsia="Arial" w:hAnsi="Arial" w:cs="Arial"/>
+              </w:rPr>
+              <w:t>.</w:t>
+            </w:r>
+          </w:p>
+          <w:p>
+            <w:pPr>
+              <w:spacing w:after="0" w:line="276" w:lineRule="auto"/>
+              <w:rPr>
+                <w:rFonts w:ascii="Courier New" w:eastAsia="Courier New" w:hAnsi="Courier New" w:cs="Courier New"/>
+                <w:highlight w:val="yellow"/>
+              </w:rPr>
+            </w:pPr>
+            <w:r>
+              <w:rPr>
+                <w:rFonts w:ascii="Courier New" w:eastAsia="Courier New" w:hAnsi="Courier New" w:cs="Courier New"/>
+                <w:highlight w:val="yellow"/>
+              </w:rPr>
+              <w:t xml:space="preserve">git </w:t>
+            </w:r>
+            <w:proofErr w:type="gramStart"/>
+            <w:r>
+              <w:rPr>
+                <w:rFonts w:ascii="Courier New" w:eastAsia="Courier New" w:hAnsi="Courier New" w:cs="Courier New"/>
+                <w:highlight w:val="yellow"/>
+              </w:rPr>
+              <w:t>add .</w:t>
+            </w:r>
+            <w:proofErr w:type="gramEnd"/>
           </w:p>
           <w:p>
             <w:pPr>
@@ -1543,7 +1721,21 @@
               <w:rPr>
                 <w:rFonts w:ascii="Arial" w:eastAsia="Arial" w:hAnsi="Arial" w:cs="Arial"/>
               </w:rPr>
-              <w:t>Finally changes in script is successfully commit to Github.</w:t>
+              <w:t xml:space="preserve">Finally changes in script is successfully commit to </w:t>
+            </w:r>
+            <w:proofErr w:type="spellStart"/>
+            <w:r>
+              <w:rPr>
+                <w:rFonts w:ascii="Arial" w:eastAsia="Arial" w:hAnsi="Arial" w:cs="Arial"/>
+              </w:rPr>
+              <w:t>Github</w:t>
+            </w:r>
+            <w:proofErr w:type="spellEnd"/>
+            <w:r>
+              <w:rPr>
+                <w:rFonts w:ascii="Arial" w:eastAsia="Arial" w:hAnsi="Arial" w:cs="Arial"/>
+              </w:rPr>
+              <w:t>.</w:t>
             </w:r>
           </w:p>
         </w:tc>
@@ -1571,7 +1763,25 @@
                 <w:bCs/>
               </w:rPr>
               <w:lastRenderedPageBreak/>
-              <w:t xml:space="preserve">Reference Youtube Video: </w:t>
+              <w:t xml:space="preserve">Reference </w:t>
+            </w:r>
+            <w:proofErr w:type="spellStart"/>
+            <w:r>
+              <w:rPr>
+                <w:rFonts w:ascii="Times New Roman" w:eastAsia="Times New Roman" w:hAnsi="Times New Roman" w:cs="Times New Roman"/>
+                <w:b/>
+                <w:bCs/>
+              </w:rPr>
+              <w:t>Youtube</w:t>
+            </w:r>
+            <w:proofErr w:type="spellEnd"/>
+            <w:r>
+              <w:rPr>
+                <w:rFonts w:ascii="Times New Roman" w:eastAsia="Times New Roman" w:hAnsi="Times New Roman" w:cs="Times New Roman"/>
+                <w:b/>
+                <w:bCs/>
+              </w:rPr>
+              <w:t xml:space="preserve"> Video: </w:t>
             </w:r>
             <w:r>
               <w:rPr>
@@ -1599,12 +1809,8 @@
       </w:pPr>
     </w:p>
     <w:sectPr>
-      <w:headerReference w:type="even" r:id="rId20"/>
-      <w:headerReference w:type="default" r:id="rId21"/>
-      <w:footerReference w:type="even" r:id="rId22"/>
-      <w:footerReference w:type="default" r:id="rId23"/>
-      <w:headerReference w:type="first" r:id="rId24"/>
-      <w:footerReference w:type="first" r:id="rId25"/>
+      <w:headerReference w:type="default" r:id="rId20"/>
+      <w:footerReference w:type="default" r:id="rId21"/>
       <w:pgSz w:w="11906" w:h="16838"/>
       <w:pgMar w:top="1440" w:right="1440" w:bottom="1440" w:left="1440" w:header="720" w:footer="720" w:gutter="0"/>
       <w:pgNumType w:start="1"/>
@@ -1645,16 +1851,6 @@
     <w:pPr>
       <w:pStyle w:val="Footer"/>
     </w:pPr>
-  </w:p>
-</w:ftr>
-</file>
-
-<file path=word/footer2.xml><?xml version="1.0" encoding="utf-8"?>
-<w:ftr xmlns:wpc="http://schemas.microsoft.com/office/word/2010/wordprocessingCanvas" xmlns:cx="http://schemas.microsoft.com/office/drawing/2014/chartex" xmlns:cx1="http://schemas.microsoft.com/office/drawing/2015/9/8/chartex" xmlns:cx2="http://schemas.microsoft.com/office/drawing/2015/10/21/chartex" xmlns:cx3="http://schemas.microsoft.com/office/drawing/2016/5/9/chartex" xmlns:cx4="http://schemas.microsoft.com/office/drawing/2016/5/10/chartex" xmlns:cx5="http://schemas.microsoft.com/office/drawing/2016/5/11/chartex" xmlns:cx6="http://schemas.microsoft.com/office/drawing/2016/5/12/chartex" xmlns:cx7="http://schemas.microsoft.com/office/drawing/2016/5/13/chartex" xmlns:cx8="http://schemas.microsoft.com/office/drawing/2016/5/14/chartex" xmlns:mc="http://schemas.openxmlformats.org/markup-compatibility/2006" xmlns:aink="http://schemas.microsoft.com/office/drawing/2016/ink" xmlns:am3d="http://schemas.microsoft.com/office/drawing/2017/model3d" xmlns:o="urn:schemas-microsoft-com:office:office" xmlns:oel="http://schemas.microsoft.com/office/2019/extlst" xmlns:r="http://schemas.openxmlformats.org/officeDocument/2006/relationships" xmlns:m="http://schemas.openxmlformats.org/officeDocument/2006/math" xmlns:v="urn:schemas-microsoft-com:vml" xmlns:wp14="http://schemas.microsoft.com/office/word/2010/wordprocessingDrawing" xmlns:wp="http://schemas.openxmlformats.org/drawingml/2006/wordprocessingDrawing" xmlns:w10="urn:schemas-microsoft-com:office:word" xmlns:w="http://schemas.openxmlformats.org/wordprocessingml/2006/main" xmlns:w14="http://schemas.microsoft.com/office/word/2010/wordml" xmlns:w15="http://schemas.microsoft.com/office/word/2012/wordml" xmlns:w16cex="http://schemas.microsoft.com/office/word/2018/wordml/cex" xmlns:w16cid="http://schemas.microsoft.com/office/word/2016/wordml/cid" xmlns:w16="http://schemas.microsoft.com/office/word/2018/wordml" xmlns:w16du="http://schemas.microsoft.com/office/word/2023/wordml/word16du" xmlns:w16sdtdh="http://schemas.microsoft.com/office/word/2020/wordml/sdtdatahash" xmlns:w16sdtfl="http://schemas.microsoft.com/office/word/2024/wordml/sdtformatlock" xmlns:w16se="http://schemas.microsoft.com/office/word/2015/wordml/symex" xmlns:wpg="http://schemas.microsoft.com/office/word/2010/wordprocessingGroup" xmlns:wpi="http://schemas.microsoft.com/office/word/2010/wordprocessingInk" xmlns:wne="http://schemas.microsoft.com/office/word/2006/wordml" xmlns:wps="http://schemas.microsoft.com/office/word/2010/wordprocessingShape" mc:Ignorable="w14 w15 w16se w16cid w16 w16cex w16sdtdh w16sdtfl w16du wp14">
-  <w:p>
-    <w:pPr>
-      <w:pStyle w:val="Footer"/>
-    </w:pPr>
     <w:r>
       <w:t>23cs</w:t>
     </w:r>
@@ -1662,16 +1858,6 @@
       <w:t>091</w:t>
     </w:r>
   </w:p>
-  <w:p>
-    <w:pPr>
-      <w:pStyle w:val="Footer"/>
-    </w:pPr>
-  </w:p>
-</w:ftr>
-</file>
-
-<file path=word/footer3.xml><?xml version="1.0" encoding="utf-8"?>
-<w:ftr xmlns:wpc="http://schemas.microsoft.com/office/word/2010/wordprocessingCanvas" xmlns:cx="http://schemas.microsoft.com/office/drawing/2014/chartex" xmlns:cx1="http://schemas.microsoft.com/office/drawing/2015/9/8/chartex" xmlns:cx2="http://schemas.microsoft.com/office/drawing/2015/10/21/chartex" xmlns:cx3="http://schemas.microsoft.com/office/drawing/2016/5/9/chartex" xmlns:cx4="http://schemas.microsoft.com/office/drawing/2016/5/10/chartex" xmlns:cx5="http://schemas.microsoft.com/office/drawing/2016/5/11/chartex" xmlns:cx6="http://schemas.microsoft.com/office/drawing/2016/5/12/chartex" xmlns:cx7="http://schemas.microsoft.com/office/drawing/2016/5/13/chartex" xmlns:cx8="http://schemas.microsoft.com/office/drawing/2016/5/14/chartex" xmlns:mc="http://schemas.openxmlformats.org/markup-compatibility/2006" xmlns:aink="http://schemas.microsoft.com/office/drawing/2016/ink" xmlns:am3d="http://schemas.microsoft.com/office/drawing/2017/model3d" xmlns:o="urn:schemas-microsoft-com:office:office" xmlns:oel="http://schemas.microsoft.com/office/2019/extlst" xmlns:r="http://schemas.openxmlformats.org/officeDocument/2006/relationships" xmlns:m="http://schemas.openxmlformats.org/officeDocument/2006/math" xmlns:v="urn:schemas-microsoft-com:vml" xmlns:wp14="http://schemas.microsoft.com/office/word/2010/wordprocessingDrawing" xmlns:wp="http://schemas.openxmlformats.org/drawingml/2006/wordprocessingDrawing" xmlns:w10="urn:schemas-microsoft-com:office:word" xmlns:w="http://schemas.openxmlformats.org/wordprocessingml/2006/main" xmlns:w14="http://schemas.microsoft.com/office/word/2010/wordml" xmlns:w15="http://schemas.microsoft.com/office/word/2012/wordml" xmlns:w16cex="http://schemas.microsoft.com/office/word/2018/wordml/cex" xmlns:w16cid="http://schemas.microsoft.com/office/word/2016/wordml/cid" xmlns:w16="http://schemas.microsoft.com/office/word/2018/wordml" xmlns:w16du="http://schemas.microsoft.com/office/word/2023/wordml/word16du" xmlns:w16sdtdh="http://schemas.microsoft.com/office/word/2020/wordml/sdtdatahash" xmlns:w16sdtfl="http://schemas.microsoft.com/office/word/2024/wordml/sdtformatlock" xmlns:w16se="http://schemas.microsoft.com/office/word/2015/wordml/symex" xmlns:wpg="http://schemas.microsoft.com/office/word/2010/wordprocessingGroup" xmlns:wpi="http://schemas.microsoft.com/office/word/2010/wordprocessingInk" xmlns:wne="http://schemas.microsoft.com/office/word/2006/wordml" xmlns:wps="http://schemas.microsoft.com/office/word/2010/wordprocessingShape" mc:Ignorable="w14 w15 w16se w16cid w16 w16cex w16sdtdh w16sdtfl w16du wp14">
   <w:p>
     <w:pPr>
       <w:pStyle w:val="Footer"/>
@@ -1706,16 +1892,6 @@
 </file>
 
 <file path=word/header1.xml><?xml version="1.0" encoding="utf-8"?>
-<w:hdr xmlns:wpc="http://schemas.microsoft.com/office/word/2010/wordprocessingCanvas" xmlns:cx="http://schemas.microsoft.com/office/drawing/2014/chartex" xmlns:cx1="http://schemas.microsoft.com/office/drawing/2015/9/8/chartex" xmlns:cx2="http://schemas.microsoft.com/office/drawing/2015/10/21/chartex" xmlns:cx3="http://schemas.microsoft.com/office/drawing/2016/5/9/chartex" xmlns:cx4="http://schemas.microsoft.com/office/drawing/2016/5/10/chartex" xmlns:cx5="http://schemas.microsoft.com/office/drawing/2016/5/11/chartex" xmlns:cx6="http://schemas.microsoft.com/office/drawing/2016/5/12/chartex" xmlns:cx7="http://schemas.microsoft.com/office/drawing/2016/5/13/chartex" xmlns:cx8="http://schemas.microsoft.com/office/drawing/2016/5/14/chartex" xmlns:mc="http://schemas.openxmlformats.org/markup-compatibility/2006" xmlns:aink="http://schemas.microsoft.com/office/drawing/2016/ink" xmlns:am3d="http://schemas.microsoft.com/office/drawing/2017/model3d" xmlns:o="urn:schemas-microsoft-com:office:office" xmlns:oel="http://schemas.microsoft.com/office/2019/extlst" xmlns:r="http://schemas.openxmlformats.org/officeDocument/2006/relationships" xmlns:m="http://schemas.openxmlformats.org/officeDocument/2006/math" xmlns:v="urn:schemas-microsoft-com:vml" xmlns:wp14="http://schemas.microsoft.com/office/word/2010/wordprocessingDrawing" xmlns:wp="http://schemas.openxmlformats.org/drawingml/2006/wordprocessingDrawing" xmlns:w10="urn:schemas-microsoft-com:office:word" xmlns:w="http://schemas.openxmlformats.org/wordprocessingml/2006/main" xmlns:w14="http://schemas.microsoft.com/office/word/2010/wordml" xmlns:w15="http://schemas.microsoft.com/office/word/2012/wordml" xmlns:w16cex="http://schemas.microsoft.com/office/word/2018/wordml/cex" xmlns:w16cid="http://schemas.microsoft.com/office/word/2016/wordml/cid" xmlns:w16="http://schemas.microsoft.com/office/word/2018/wordml" xmlns:w16du="http://schemas.microsoft.com/office/word/2023/wordml/word16du" xmlns:w16sdtdh="http://schemas.microsoft.com/office/word/2020/wordml/sdtdatahash" xmlns:w16sdtfl="http://schemas.microsoft.com/office/word/2024/wordml/sdtformatlock" xmlns:w16se="http://schemas.microsoft.com/office/word/2015/wordml/symex" xmlns:wpg="http://schemas.microsoft.com/office/word/2010/wordprocessingGroup" xmlns:wpi="http://schemas.microsoft.com/office/word/2010/wordprocessingInk" xmlns:wne="http://schemas.microsoft.com/office/word/2006/wordml" xmlns:wps="http://schemas.microsoft.com/office/word/2010/wordprocessingShape" mc:Ignorable="w14 w15 w16se w16cid w16 w16cex w16sdtdh w16sdtfl w16du wp14">
-  <w:p>
-    <w:pPr>
-      <w:pStyle w:val="Header"/>
-    </w:pPr>
-  </w:p>
-</w:hdr>
-</file>
-
-<file path=word/header2.xml><?xml version="1.0" encoding="utf-8"?>
 <w:hdr xmlns:wpc="http://schemas.microsoft.com/office/word/2010/wordprocessingCanvas" xmlns:cx="http://schemas.microsoft.com/office/drawing/2014/chartex" xmlns:cx1="http://schemas.microsoft.com/office/drawing/2015/9/8/chartex" xmlns:cx2="http://schemas.microsoft.com/office/drawing/2015/10/21/chartex" xmlns:cx3="http://schemas.microsoft.com/office/drawing/2016/5/9/chartex" xmlns:cx4="http://schemas.microsoft.com/office/drawing/2016/5/10/chartex" xmlns:cx5="http://schemas.microsoft.com/office/drawing/2016/5/11/chartex" xmlns:cx6="http://schemas.microsoft.com/office/drawing/2016/5/12/chartex" xmlns:cx7="http://schemas.microsoft.com/office/drawing/2016/5/13/chartex" xmlns:cx8="http://schemas.microsoft.com/office/drawing/2016/5/14/chartex" xmlns:mc="http://schemas.openxmlformats.org/markup-compatibility/2006" xmlns:aink="http://schemas.microsoft.com/office/drawing/2016/ink" xmlns:am3d="http://schemas.microsoft.com/office/drawing/2017/model3d" xmlns:o="urn:schemas-microsoft-com:office:office" xmlns:oel="http://schemas.microsoft.com/office/2019/extlst" xmlns:r="http://schemas.openxmlformats.org/officeDocument/2006/relationships" xmlns:m="http://schemas.openxmlformats.org/officeDocument/2006/math" xmlns:v="urn:schemas-microsoft-com:vml" xmlns:wp14="http://schemas.microsoft.com/office/word/2010/wordprocessingDrawing" xmlns:wp="http://schemas.openxmlformats.org/drawingml/2006/wordprocessingDrawing" xmlns:w10="urn:schemas-microsoft-com:office:word" xmlns:w="http://schemas.openxmlformats.org/wordprocessingml/2006/main" xmlns:w14="http://schemas.microsoft.com/office/word/2010/wordml" xmlns:w15="http://schemas.microsoft.com/office/word/2012/wordml" xmlns:w16cex="http://schemas.microsoft.com/office/word/2018/wordml/cex" xmlns:w16cid="http://schemas.microsoft.com/office/word/2016/wordml/cid" xmlns:w16="http://schemas.microsoft.com/office/word/2018/wordml" xmlns:w16du="http://schemas.microsoft.com/office/word/2023/wordml/word16du" xmlns:w16sdtdh="http://schemas.microsoft.com/office/word/2020/wordml/sdtdatahash" xmlns:w16sdtfl="http://schemas.microsoft.com/office/word/2024/wordml/sdtformatlock" xmlns:w16se="http://schemas.microsoft.com/office/word/2015/wordml/symex" xmlns:wpg="http://schemas.microsoft.com/office/word/2010/wordprocessingGroup" xmlns:wpi="http://schemas.microsoft.com/office/word/2010/wordprocessingInk" xmlns:wne="http://schemas.microsoft.com/office/word/2006/wordml" xmlns:wps="http://schemas.microsoft.com/office/word/2010/wordprocessingShape" mc:Ignorable="w14 w15 w16se w16cid w16 w16cex w16sdtdh w16sdtfl w16du wp14">
   <w:p>
     <w:pPr>
@@ -1808,16 +1984,6 @@
       </w:rPr>
       <w:t>OCCE4001 - SOFTWARE TESTING</w:t>
     </w:r>
-  </w:p>
-</w:hdr>
-</file>
-
-<file path=word/header3.xml><?xml version="1.0" encoding="utf-8"?>
-<w:hdr xmlns:wpc="http://schemas.microsoft.com/office/word/2010/wordprocessingCanvas" xmlns:cx="http://schemas.microsoft.com/office/drawing/2014/chartex" xmlns:cx1="http://schemas.microsoft.com/office/drawing/2015/9/8/chartex" xmlns:cx2="http://schemas.microsoft.com/office/drawing/2015/10/21/chartex" xmlns:cx3="http://schemas.microsoft.com/office/drawing/2016/5/9/chartex" xmlns:cx4="http://schemas.microsoft.com/office/drawing/2016/5/10/chartex" xmlns:cx5="http://schemas.microsoft.com/office/drawing/2016/5/11/chartex" xmlns:cx6="http://schemas.microsoft.com/office/drawing/2016/5/12/chartex" xmlns:cx7="http://schemas.microsoft.com/office/drawing/2016/5/13/chartex" xmlns:cx8="http://schemas.microsoft.com/office/drawing/2016/5/14/chartex" xmlns:mc="http://schemas.openxmlformats.org/markup-compatibility/2006" xmlns:aink="http://schemas.microsoft.com/office/drawing/2016/ink" xmlns:am3d="http://schemas.microsoft.com/office/drawing/2017/model3d" xmlns:o="urn:schemas-microsoft-com:office:office" xmlns:oel="http://schemas.microsoft.com/office/2019/extlst" xmlns:r="http://schemas.openxmlformats.org/officeDocument/2006/relationships" xmlns:m="http://schemas.openxmlformats.org/officeDocument/2006/math" xmlns:v="urn:schemas-microsoft-com:vml" xmlns:wp14="http://schemas.microsoft.com/office/word/2010/wordprocessingDrawing" xmlns:wp="http://schemas.openxmlformats.org/drawingml/2006/wordprocessingDrawing" xmlns:w10="urn:schemas-microsoft-com:office:word" xmlns:w="http://schemas.openxmlformats.org/wordprocessingml/2006/main" xmlns:w14="http://schemas.microsoft.com/office/word/2010/wordml" xmlns:w15="http://schemas.microsoft.com/office/word/2012/wordml" xmlns:w16cex="http://schemas.microsoft.com/office/word/2018/wordml/cex" xmlns:w16cid="http://schemas.microsoft.com/office/word/2016/wordml/cid" xmlns:w16="http://schemas.microsoft.com/office/word/2018/wordml" xmlns:w16du="http://schemas.microsoft.com/office/word/2023/wordml/word16du" xmlns:w16sdtdh="http://schemas.microsoft.com/office/word/2020/wordml/sdtdatahash" xmlns:w16sdtfl="http://schemas.microsoft.com/office/word/2024/wordml/sdtformatlock" xmlns:w16se="http://schemas.microsoft.com/office/word/2015/wordml/symex" xmlns:wpg="http://schemas.microsoft.com/office/word/2010/wordprocessingGroup" xmlns:wpi="http://schemas.microsoft.com/office/word/2010/wordprocessingInk" xmlns:wne="http://schemas.microsoft.com/office/word/2006/wordml" xmlns:wps="http://schemas.microsoft.com/office/word/2010/wordprocessingShape" mc:Ignorable="w14 w15 w16se w16cid w16 w16cex w16sdtdh w16sdtfl w16du wp14">
-  <w:p>
-    <w:pPr>
-      <w:pStyle w:val="Header"/>
-    </w:pPr>
   </w:p>
 </w:hdr>
 </file>

</xml_diff>